<commit_message>
Recria Ads: cenário Negócio digital (7 cenários) e aulas de no máximo 10 minutos
Co-Authored-By: Claude Opus 5.5 <noreply@anthropic.com>
Claude-Session: https://claude.ai/code/session_01RDM8d5cVD9w4uwiMSyLkgt
</commit_message>
<xml_diff>
--- a/agencia-recria/cursos/recria-ads/para-ler-e-gravar/Ementa do curso.docx
+++ b/agencia-recria/cursos/recria-ads/para-ler-e-gravar/Ementa do curso.docx
@@ -94,7 +94,7 @@
     </w:p>
     <w:p>
       <w:r>
-        <w:t>Toda aula termina com o bloco "Como adaptar" para os 6 cenários:</w:t>
+        <w:t>Toda aula termina com o bloco "Como adaptar" para os 7 cenários:</w:t>
       </w:r>
     </w:p>
     <w:p>
@@ -143,6 +143,19 @@
       </w:pPr>
       <w:r>
         <w:t>Serviços e consultoria (B2B)</w:t>
+      </w:r>
+    </w:p>
+    <w:p>
+      <w:pPr>
+        <w:pStyle w:val="ListNumber"/>
+      </w:pPr>
+      <w:r>
+        <w:t>Negócio digital (infoprodutos, cursos, mentorias, consultorias e serviços entregues online)</w:t>
+      </w:r>
+    </w:p>
+    <w:p>
+      <w:r>
+        <w:t>Negócios de educação, saúde e bem-estar com espaço físico (escola, clínica, academia, consultório) entram em Negócio local. A versão 100% online deles entra em Negócio digital.</w:t>
       </w:r>
     </w:p>
     <w:p>
@@ -407,7 +420,7 @@
     <w:p/>
     <w:p>
       <w:r>
-        <w:t>29 aulas de 8 a 12 min (cerca de 4h) + materiais.</w:t>
+        <w:t>29 aulas de no máximo 10 min cada (cerca de 3 horas no total) + materiais. Regra: se uma aula passar de 10 minutos, ela vira duas.</w:t>
       </w:r>
     </w:p>
     <w:p>
@@ -692,7 +705,7 @@
         <w:pStyle w:val="ListNumber"/>
       </w:pPr>
       <w:r>
-        <w:t>🖥️ Montando juntos + 📎 calendários prontos para os 6 cenários</w:t>
+        <w:t>🖥️ Montando juntos + 📎 calendários prontos para os 7 cenários</w:t>
       </w:r>
     </w:p>
     <w:p>

</xml_diff>

<commit_message>
Recria Ads: Módulo 6 com calendário de conteúdo e de anúncios separados, grupo do WhatsApp do curso e temas da Comunidade Recria
Co-Authored-By: Claude Opus 5.5 <noreply@anthropic.com>
Claude-Session: https://claude.ai/code/session_01RDM8d5cVD9w4uwiMSyLkgt
</commit_message>
<xml_diff>
--- a/agencia-recria/cursos/recria-ads/para-ler-e-gravar/Ementa do curso.docx
+++ b/agencia-recria/cursos/recria-ads/para-ler-e-gravar/Ementa do curso.docx
@@ -72,7 +72,7 @@
         <w:t>Duração:</w:t>
       </w:r>
       <w:r>
-        <w:t xml:space="preserve"> 5 semanas, seguindo 1 aula por dia (29 aulas; os últimos módulos são liberados no dia 28).</w:t>
+        <w:t xml:space="preserve"> 5 semanas, seguindo 1 aula por dia (32 aulas; os últimos módulos são liberados no dia 28).</w:t>
       </w:r>
     </w:p>
     <w:p>
@@ -420,7 +420,7 @@
     <w:p/>
     <w:p>
       <w:r>
-        <w:t>29 aulas de no máximo 10 min cada (cerca de 3 horas no total) + materiais. Regra: se uma aula passar de 10 minutos, ela vira duas.</w:t>
+        <w:t>32 aulas de no máximo 10 min cada (cerca de 3h30 no total) + materiais. Regra: se uma aula passar de 10 minutos, ela vira duas.</w:t>
       </w:r>
     </w:p>
     <w:p>
@@ -447,7 +447,7 @@
         <w:pStyle w:val="ListNumber"/>
       </w:pPr>
       <w:r>
-        <w:t>🎥 Comece por aqui: como o curso funciona, a liberação semanal com atividades, como assistir o grupo do WhatsApp da turma e o acesso de 1 ano</w:t>
+        <w:t>🎥 Comece por aqui: como o curso funciona, a liberação semanal com atividades, como assistir o grupo do WhatsApp do curso e o acesso de 1 ano</w:t>
       </w:r>
     </w:p>
     <w:p>
@@ -681,7 +681,7 @@
         <w:rPr>
           <w:color w:val="9A7424"/>
         </w:rPr>
-        <w:t>Módulo 6: Calendário com IA</w:t>
+        <w:t>Módulo 6: Os dois calendários (conteúdo e anúncios) com IA</w:t>
       </w:r>
     </w:p>
     <w:p>
@@ -689,7 +689,7 @@
         <w:pStyle w:val="ListNumber"/>
       </w:pPr>
       <w:r>
-        <w:t>🖥️ Como eu monto o calendário</w:t>
+        <w:t>🎥 Dois calendários, dois objetivos: por que separar o calendário de conteúdo do calendário de anúncios</w:t>
       </w:r>
     </w:p>
     <w:p>
@@ -697,7 +697,7 @@
         <w:pStyle w:val="ListNumber"/>
       </w:pPr>
       <w:r>
-        <w:t>🖥️ O prompt-mestre</w:t>
+        <w:t>🖥️ Calendário de conteúdo do feed: os objetivos (engajar, atrair novos seguidores, vender) e o funil em conteúdos diferentes (topo, meio e fundo)</w:t>
       </w:r>
     </w:p>
     <w:p>
@@ -705,7 +705,31 @@
         <w:pStyle w:val="ListNumber"/>
       </w:pPr>
       <w:r>
-        <w:t>🖥️ Montando juntos + 📎 calendários prontos para os 7 cenários</w:t>
+        <w:t>🖥️ Topo, meio e fundo no mesmo conteúdo: quando fazer e como distribuir no calendário</w:t>
+      </w:r>
+    </w:p>
+    <w:p>
+      <w:pPr>
+        <w:pStyle w:val="ListNumber"/>
+      </w:pPr>
+      <w:r>
+        <w:t>💻 Montando o calendário de conteúdo com IA (prompt-mestre de conteúdo)</w:t>
+      </w:r>
+    </w:p>
+    <w:p>
+      <w:pPr>
+        <w:pStyle w:val="ListNumber"/>
+      </w:pPr>
+      <w:r>
+        <w:t>🎥 Calendário de anúncios: dark post × anúncio que também vai para o feed, e a CTA certa para cada um</w:t>
+      </w:r>
+    </w:p>
+    <w:p>
+      <w:pPr>
+        <w:pStyle w:val="ListNumber"/>
+      </w:pPr>
+      <w:r>
+        <w:t>💻 Montando o calendário de anúncios com IA (prompt-mestre de anúncios) + 📎 calendários prontos para os 7 cenários</w:t>
       </w:r>
     </w:p>
     <w:p>
@@ -764,6 +788,64 @@
     </w:p>
     <w:p>
       <w:r>
+        <w:t>Proposta: a escola de marketing, negócio, conteúdo e comercial para quem quer reinventar e recriar o próprio negócio. A essência do que a Agência Recria aplica, condensada com o conhecimento de grandes pensadores.</w:t>
+      </w:r>
+    </w:p>
+    <w:p>
+      <w:r>
+        <w:t>Temas que entram:</w:t>
+      </w:r>
+    </w:p>
+    <w:p>
+      <w:pPr>
+        <w:pStyle w:val="ListBullet"/>
+      </w:pPr>
+      <w:r>
+        <w:t>documentar a rotina, e decidir o que expor e o que não expor da vida pessoal</w:t>
+      </w:r>
+    </w:p>
+    <w:p>
+      <w:pPr>
+        <w:pStyle w:val="ListBullet"/>
+      </w:pPr>
+      <w:r>
+        <w:t>social content, o novo social media</w:t>
+      </w:r>
+    </w:p>
+    <w:p>
+      <w:pPr>
+        <w:pStyle w:val="ListBullet"/>
+      </w:pPr>
+      <w:r>
+        <w:t>dados e indicadores do negócio (quais números acompanhar)</w:t>
+      </w:r>
+    </w:p>
+    <w:p>
+      <w:pPr>
+        <w:pStyle w:val="ListBullet"/>
+      </w:pPr>
+      <w:r>
+        <w:t>esteira de produtos (da oferta de entrada ao produto principal)</w:t>
+      </w:r>
+    </w:p>
+    <w:p>
+      <w:pPr>
+        <w:pStyle w:val="ListBullet"/>
+      </w:pPr>
+      <w:r>
+        <w:t>comercial e vendas</w:t>
+      </w:r>
+    </w:p>
+    <w:p>
+      <w:pPr>
+        <w:pStyle w:val="ListBullet"/>
+      </w:pPr>
+      <w:r>
+        <w:t>posicionamento, rebrand e reinvenção do negócio</w:t>
+      </w:r>
+    </w:p>
+    <w:p>
+      <w:r>
         <w:t>Trilhas: Recria Ads (incluso), Posicionamento e negócio, Marketing e comportamento (livros), Diferenciação e criatividade, Comercial, Rebrand, Storytelling avançado, Comunidade e relacionamento, IA sem ficar fake, Gravação, Tráfego pago, aulas com convidados.</w:t>
       </w:r>
     </w:p>
@@ -790,7 +872,7 @@
         <w:rPr>
           <w:color w:val="9A7424"/>
         </w:rPr>
-        <w:t>Grupo do WhatsApp da turma (um a mais)</w:t>
+        <w:t>Grupo do WhatsApp do curso (um a mais)</w:t>
       </w:r>
     </w:p>
     <w:p>
@@ -798,7 +880,7 @@
         <w:pStyle w:val="ListBullet"/>
       </w:pPr>
       <w:r>
-        <w:t>Formato: Comunidade do WhatsApp, para que os alunos não vejam os números uns dos outros. Na comunicação, chamar só de "grupo do WhatsApp da turma".</w:t>
+        <w:t>Formato: Comunidade do WhatsApp, para que os alunos não vejam os números uns dos outros. Na comunicação, chamar só de "grupo do WhatsApp do curso".</w:t>
       </w:r>
     </w:p>
     <w:p>
@@ -806,7 +888,7 @@
         <w:pStyle w:val="ListBullet"/>
       </w:pPr>
       <w:r>
-        <w:t>Aberto semanalmente para dúvidas; também recebe conteúdos novos, bastidores e interações.</w:t>
+        <w:t>Grupo fechado na maior parte do tempo (só a Amanda e a equipe postam conteúdos novos, bastidores e avisos). Normalmente uma vez por semana, é aberto para dúvidas e interações.</w:t>
       </w:r>
     </w:p>
     <w:p>

</xml_diff>

<commit_message>
Recria Ads: roteiros completos dos Módulos 3 a 7, resumões e materiais de cada aula
Co-Authored-By: Claude Opus 5.5 <noreply@anthropic.com>
Claude-Session: https://claude.ai/code/session_01RDM8d5cVD9w4uwiMSyLkgt
</commit_message>
<xml_diff>
--- a/agencia-recria/cursos/recria-ads/para-ler-e-gravar/Ementa do curso.docx
+++ b/agencia-recria/cursos/recria-ads/para-ler-e-gravar/Ementa do curso.docx
@@ -568,7 +568,7 @@
         <w:pStyle w:val="ListNumber"/>
       </w:pPr>
       <w:r>
-        <w:t>🎥 Níveis de consciência e funil: com verba, um conteúdo por nível</w:t>
+        <w:t>🖥️ Níveis de consciência e funil: com verba, um conteúdo por nível</w:t>
       </w:r>
     </w:p>
     <w:p>
@@ -576,7 +576,7 @@
         <w:pStyle w:val="ListNumber"/>
       </w:pPr>
       <w:r>
-        <w:t>🖥️ Com pouca verba: os três níveis num só carrossel</w:t>
+        <w:t>🖥️ Com pouca verba: os três níveis num só carrossel (montado ao vivo no Canva)</w:t>
       </w:r>
     </w:p>
     <w:p>
@@ -603,7 +603,7 @@
         <w:pStyle w:val="ListNumber"/>
       </w:pPr>
       <w:r>
-        <w:t>🎥 Copy para legenda, carrossel e roteiro + CTA</w:t>
+        <w:t>🎙️ Copy para legenda, carrossel e roteiro + CTA</w:t>
       </w:r>
     </w:p>
     <w:p>
@@ -611,7 +611,7 @@
         <w:pStyle w:val="ListNumber"/>
       </w:pPr>
       <w:r>
-        <w:t>🖥️ Ganchos com IA + 📎 banco de ganchos por nicho</w:t>
+        <w:t>💻 Ganchos com IA + 📎 banco de ganchos por nicho</w:t>
       </w:r>
     </w:p>
     <w:p>
@@ -662,7 +662,7 @@
         <w:pStyle w:val="ListNumber"/>
       </w:pPr>
       <w:r>
-        <w:t>🔎 Dove e as pessoas reais: influenciadoras e anúncio sem cara de anúncio (+ outros casos a checar)</w:t>
+        <w:t>🔎 Dove e a beleza real (Retratos da Real Beleza, 2013)</w:t>
       </w:r>
     </w:p>
     <w:p>
@@ -670,7 +670,7 @@
         <w:pStyle w:val="ListNumber"/>
       </w:pPr>
       <w:r>
-        <w:t>🎥 Trend e marketing de oportunidade: quando usar e quando queima o filme</w:t>
+        <w:t>🎙️ Trend e marketing de oportunidade: quando usar e quando queima o filme</w:t>
       </w:r>
     </w:p>
     <w:p>
@@ -756,7 +756,7 @@
         <w:pStyle w:val="ListNumber"/>
       </w:pPr>
       <w:r>
-        <w:t>🖥️ Montando o seu plano de 30 dias</w:t>
+        <w:t>💻 Montando o seu Plano de 30 dias (com 5W2H)</w:t>
       </w:r>
     </w:p>
     <w:p>

</xml_diff>

<commit_message>
Recria Ads: divide a aula 1.2 em 1.2.1 e 1.2.2 (máximo 10 min por aula)
Roteiro, slides, legenda e ementa atualizados (33 aulas).

Co-Authored-By: Claude Opus 5.5 <noreply@anthropic.com>
Claude-Session: https://claude.ai/code/session_01RDM8d5cVD9w4uwiMSyLkgt
</commit_message>
<xml_diff>
--- a/agencia-recria/cursos/recria-ads/para-ler-e-gravar/Ementa do curso.docx
+++ b/agencia-recria/cursos/recria-ads/para-ler-e-gravar/Ementa do curso.docx
@@ -72,7 +72,7 @@
         <w:t>Duração:</w:t>
       </w:r>
       <w:r>
-        <w:t xml:space="preserve"> 5 semanas, seguindo 1 aula por dia (32 aulas; os últimos módulos são liberados no dia 28).</w:t>
+        <w:t xml:space="preserve"> 5 semanas, seguindo 1 aula por dia (33 aulas; os últimos módulos são liberados no dia 28).</w:t>
       </w:r>
     </w:p>
     <w:p>
@@ -260,7 +260,7 @@
           <w:p>
             <w:r/>
             <w:r>
-              <w:t>Módulos 0, 1, 2 + bônus (11 aulas)</w:t>
+              <w:t>Módulos 0, 1, 2 + bônus (12 aulas)</w:t>
             </w:r>
           </w:p>
         </w:tc>
@@ -420,7 +420,7 @@
     <w:p/>
     <w:p>
       <w:r>
-        <w:t>32 aulas de no máximo 10 min cada (cerca de 3h30 no total) + materiais. Regra: se uma aula passar de 10 minutos, ela vira duas.</w:t>
+        <w:t>33 aulas de no máximo 10 min cada (cerca de 3h30 no total) + materiais. Regra: se uma aula passar de 10 minutos, ela vira duas.</w:t>
       </w:r>
     </w:p>
     <w:p>
@@ -471,34 +471,42 @@
     </w:p>
     <w:p>
       <w:pPr>
-        <w:pStyle w:val="ListNumber"/>
+        <w:pStyle w:val="ListBullet"/>
       </w:pPr>
       <w:r>
-        <w:t>🎥 Como o cérebro decide (e por que a emoção vem antes)</w:t>
+        <w:t>1.1 🎥 Como o cérebro decide (e por que a emoção vem antes)</w:t>
       </w:r>
     </w:p>
     <w:p>
       <w:pPr>
-        <w:pStyle w:val="ListNumber"/>
+        <w:pStyle w:val="ListBullet"/>
       </w:pPr>
       <w:r>
-        <w:t>🎥 Gatilhos sem manipulação (pitada de Cialdini)</w:t>
+        <w:t>1.2.1 🖥️ Gatilhos sem manipulação, parte 1 (pitada de Cialdini): reciprocidade, compromisso, prova social e afeição</w:t>
       </w:r>
     </w:p>
     <w:p>
       <w:pPr>
-        <w:pStyle w:val="ListNumber"/>
+        <w:pStyle w:val="ListBullet"/>
       </w:pPr>
       <w:r>
-        <w:t>🎥 Desejo antes da oferta: oferta direta × indireta</w:t>
+        <w:t>1.2.2 🖥️ Gatilhos sem manipulação, parte 2: autoridade, escassez, unidade + gatilho não é truque (📎 Mapa dos 7 princípios)</w:t>
       </w:r>
     </w:p>
     <w:p>
       <w:pPr>
-        <w:pStyle w:val="ListNumber"/>
+        <w:pStyle w:val="ListBullet"/>
       </w:pPr>
       <w:r>
-        <w:t>🔎 Burger King × Dragon Ball: a memória afetiva que vende</w:t>
+        <w:t>1.3 🎥 Desejo antes da oferta: oferta direta × indireta</w:t>
+      </w:r>
+    </w:p>
+    <w:p>
+      <w:pPr>
+        <w:pStyle w:val="ListBullet"/>
+      </w:pPr>
+      <w:r>
+        <w:t>1.4 🔎 Burger King × Dragon Ball: a memória afetiva que vende</w:t>
       </w:r>
     </w:p>
     <w:p>

</xml_diff>

<commit_message>
Recria Ads: volta a aula 1.2 para uma aula só (regravada dentro dos 10 min)
Desfaz a divisão em 1.2.1 e 1.2.2.

Co-Authored-By: Claude Opus 5.5 <noreply@anthropic.com>
Claude-Session: https://claude.ai/code/session_01RDM8d5cVD9w4uwiMSyLkgt
</commit_message>
<xml_diff>
--- a/agencia-recria/cursos/recria-ads/para-ler-e-gravar/Ementa do curso.docx
+++ b/agencia-recria/cursos/recria-ads/para-ler-e-gravar/Ementa do curso.docx
@@ -72,7 +72,7 @@
         <w:t>Duração:</w:t>
       </w:r>
       <w:r>
-        <w:t xml:space="preserve"> 5 semanas, seguindo 1 aula por dia (33 aulas; os últimos módulos são liberados no dia 28).</w:t>
+        <w:t xml:space="preserve"> 5 semanas, seguindo 1 aula por dia (32 aulas; os últimos módulos são liberados no dia 28).</w:t>
       </w:r>
     </w:p>
     <w:p>
@@ -260,7 +260,7 @@
           <w:p>
             <w:r/>
             <w:r>
-              <w:t>Módulos 0, 1, 2 + bônus (12 aulas)</w:t>
+              <w:t>Módulos 0, 1, 2 + bônus (11 aulas)</w:t>
             </w:r>
           </w:p>
         </w:tc>
@@ -420,7 +420,7 @@
     <w:p/>
     <w:p>
       <w:r>
-        <w:t>33 aulas de no máximo 10 min cada (cerca de 3h30 no total) + materiais. Regra: se uma aula passar de 10 minutos, ela vira duas.</w:t>
+        <w:t>32 aulas de no máximo 10 min cada (cerca de 3h30 no total) + materiais. Regra: se uma aula passar de 10 minutos, ela vira duas.</w:t>
       </w:r>
     </w:p>
     <w:p>
@@ -471,42 +471,34 @@
     </w:p>
     <w:p>
       <w:pPr>
-        <w:pStyle w:val="ListBullet"/>
+        <w:pStyle w:val="ListNumber"/>
       </w:pPr>
       <w:r>
-        <w:t>1.1 🎥 Como o cérebro decide (e por que a emoção vem antes)</w:t>
+        <w:t>🎥 Como o cérebro decide (e por que a emoção vem antes)</w:t>
       </w:r>
     </w:p>
     <w:p>
       <w:pPr>
-        <w:pStyle w:val="ListBullet"/>
+        <w:pStyle w:val="ListNumber"/>
       </w:pPr>
       <w:r>
-        <w:t>1.2.1 🖥️ Gatilhos sem manipulação, parte 1 (pitada de Cialdini): reciprocidade, compromisso, prova social e afeição</w:t>
+        <w:t>🎥 Gatilhos sem manipulação (pitada de Cialdini)</w:t>
       </w:r>
     </w:p>
     <w:p>
       <w:pPr>
-        <w:pStyle w:val="ListBullet"/>
+        <w:pStyle w:val="ListNumber"/>
       </w:pPr>
       <w:r>
-        <w:t>1.2.2 🖥️ Gatilhos sem manipulação, parte 2: autoridade, escassez, unidade + gatilho não é truque (📎 Mapa dos 7 princípios)</w:t>
+        <w:t>🎥 Desejo antes da oferta: oferta direta × indireta</w:t>
       </w:r>
     </w:p>
     <w:p>
       <w:pPr>
-        <w:pStyle w:val="ListBullet"/>
+        <w:pStyle w:val="ListNumber"/>
       </w:pPr>
       <w:r>
-        <w:t>1.3 🎥 Desejo antes da oferta: oferta direta × indireta</w:t>
-      </w:r>
-    </w:p>
-    <w:p>
-      <w:pPr>
-        <w:pStyle w:val="ListBullet"/>
-      </w:pPr>
-      <w:r>
-        <w:t>1.4 🔎 Burger King × Dragon Ball: a memória afetiva que vende</w:t>
+        <w:t>🔎 Burger King × Dragon Ball: a memória afetiva que vende</w:t>
       </w:r>
     </w:p>
     <w:p>

</xml_diff>